<commit_message>
Add plural (meervoud) questions to Duits Kapitel 6
5 extra questions for die Gitarren, die Städte, die Geigen,
die Hobbys, die Klaviere — added to app and exercise sheet.
123 questions total.

Co-Authored-By: Claude Sonnet 4.6 <noreply@anthropic.com>
Claude-Session: https://claude.ai/code/session_01HnMBGt9wEeYJyZk766SU4b
</commit_message>
<xml_diff>
--- a/Duits_Kapitel6_Oefenblad.docx
+++ b/Duits_Kapitel6_Oefenblad.docx
@@ -5558,6 +5558,261 @@
                 <w:szCs w:val="20"/>
               </w:rPr>
               <w:t xml:space="preserve">Waar of Niet waar: 'u' (beleefd) = 'Sie' (met hoofdletter).</w:t>
+            </w:r>
+          </w:p>
+          <w:p>
+            <w:pPr>
+              <w:pBdr>
+                <w:bottom w:val="single" w:color="AAAAAA" w:sz="4" w:space="1"/>
+              </w:pBdr>
+              <w:spacing w:after="80" w:before="40"/>
+            </w:pPr>
+            <w:r>
+              <w:t xml:space="preserve"/>
+            </w:r>
+          </w:p>
+        </w:tc>
+      </w:tr>
+    </w:tbl>
+    <w:p>
+      <w:pPr>
+        <w:spacing w:after="80"/>
+      </w:pPr>
+    </w:p>
+    <w:p>
+      <w:pPr>
+        <w:pBdr>
+          <w:bottom w:val="single" w:color="1F4E79" w:sz="6" w:space="2"/>
+        </w:pBdr>
+        <w:spacing w:after="60" w:before="200"/>
+      </w:pPr>
+      <w:r>
+        <w:rPr>
+          <w:b/>
+          <w:bCs/>
+          <w:color w:val="1F4E79"/>
+          <w:sz w:val="22"/>
+          <w:szCs w:val="22"/>
+        </w:rPr>
+        <w:t xml:space="preserve">Meervoud</w:t>
+      </w:r>
+    </w:p>
+    <w:tbl>
+      <w:tblPr>
+        <w:tblW w:type="dxa" w:w="8840"/>
+        <w:tblBorders>
+          <w:top w:val="none"/>
+          <w:left w:val="none"/>
+          <w:bottom w:val="none"/>
+          <w:right w:val="none"/>
+          <w:insideH w:val="single" w:color="auto" w:sz="4"/>
+          <w:insideV w:val="single" w:color="auto" w:sz="4"/>
+        </w:tblBorders>
+      </w:tblPr>
+      <w:tblGrid>
+        <w:gridCol w:w="700"/>
+        <w:gridCol w:w="8140"/>
+      </w:tblGrid>
+      <w:tr>
+        <w:tc>
+          <w:tcPr>
+            <w:tcW w:type="dxa" w:w="700"/>
+          </w:tcPr>
+          <w:p>
+            <w:r>
+              <w:rPr>
+                <w:b/>
+                <w:bCs/>
+                <w:sz w:val="20"/>
+                <w:szCs w:val="20"/>
+              </w:rPr>
+              <w:t xml:space="preserve">119.</w:t>
+            </w:r>
+          </w:p>
+        </w:tc>
+        <w:tc>
+          <w:tcPr>
+            <w:tcW w:type="dxa" w:w="8140"/>
+          </w:tcPr>
+          <w:p>
+            <w:r>
+              <w:rPr>
+                <w:sz w:val="20"/>
+                <w:szCs w:val="20"/>
+              </w:rPr>
+              <w:t xml:space="preserve">Meervoud: die Gitarre → ...?</w:t>
+            </w:r>
+          </w:p>
+          <w:p>
+            <w:pPr>
+              <w:pBdr>
+                <w:bottom w:val="single" w:color="AAAAAA" w:sz="4" w:space="1"/>
+              </w:pBdr>
+              <w:spacing w:after="80" w:before="40"/>
+            </w:pPr>
+            <w:r>
+              <w:t xml:space="preserve"/>
+            </w:r>
+          </w:p>
+        </w:tc>
+      </w:tr>
+      <w:tr>
+        <w:tc>
+          <w:tcPr>
+            <w:tcW w:type="dxa" w:w="700"/>
+          </w:tcPr>
+          <w:p>
+            <w:r>
+              <w:rPr>
+                <w:b/>
+                <w:bCs/>
+                <w:sz w:val="20"/>
+                <w:szCs w:val="20"/>
+              </w:rPr>
+              <w:t xml:space="preserve">120.</w:t>
+            </w:r>
+          </w:p>
+        </w:tc>
+        <w:tc>
+          <w:tcPr>
+            <w:tcW w:type="dxa" w:w="8140"/>
+          </w:tcPr>
+          <w:p>
+            <w:r>
+              <w:rPr>
+                <w:sz w:val="20"/>
+                <w:szCs w:val="20"/>
+              </w:rPr>
+              <w:t xml:space="preserve">Meervoud: die Stadt → ...?</w:t>
+            </w:r>
+          </w:p>
+          <w:p>
+            <w:pPr>
+              <w:pBdr>
+                <w:bottom w:val="single" w:color="AAAAAA" w:sz="4" w:space="1"/>
+              </w:pBdr>
+              <w:spacing w:after="80" w:before="40"/>
+            </w:pPr>
+            <w:r>
+              <w:t xml:space="preserve"/>
+            </w:r>
+          </w:p>
+        </w:tc>
+      </w:tr>
+      <w:tr>
+        <w:tc>
+          <w:tcPr>
+            <w:tcW w:type="dxa" w:w="700"/>
+          </w:tcPr>
+          <w:p>
+            <w:r>
+              <w:rPr>
+                <w:b/>
+                <w:bCs/>
+                <w:sz w:val="20"/>
+                <w:szCs w:val="20"/>
+              </w:rPr>
+              <w:t xml:space="preserve">121.</w:t>
+            </w:r>
+          </w:p>
+        </w:tc>
+        <w:tc>
+          <w:tcPr>
+            <w:tcW w:type="dxa" w:w="8140"/>
+          </w:tcPr>
+          <w:p>
+            <w:r>
+              <w:rPr>
+                <w:sz w:val="20"/>
+                <w:szCs w:val="20"/>
+              </w:rPr>
+              <w:t xml:space="preserve">Meervoud: die Geige → ...?</w:t>
+            </w:r>
+          </w:p>
+          <w:p>
+            <w:pPr>
+              <w:pBdr>
+                <w:bottom w:val="single" w:color="AAAAAA" w:sz="4" w:space="1"/>
+              </w:pBdr>
+              <w:spacing w:after="80" w:before="40"/>
+            </w:pPr>
+            <w:r>
+              <w:t xml:space="preserve"/>
+            </w:r>
+          </w:p>
+        </w:tc>
+      </w:tr>
+      <w:tr>
+        <w:tc>
+          <w:tcPr>
+            <w:tcW w:type="dxa" w:w="700"/>
+          </w:tcPr>
+          <w:p>
+            <w:r>
+              <w:rPr>
+                <w:b/>
+                <w:bCs/>
+                <w:sz w:val="20"/>
+                <w:szCs w:val="20"/>
+              </w:rPr>
+              <w:t xml:space="preserve">122.</w:t>
+            </w:r>
+          </w:p>
+        </w:tc>
+        <w:tc>
+          <w:tcPr>
+            <w:tcW w:type="dxa" w:w="8140"/>
+          </w:tcPr>
+          <w:p>
+            <w:r>
+              <w:rPr>
+                <w:sz w:val="20"/>
+                <w:szCs w:val="20"/>
+              </w:rPr>
+              <w:t xml:space="preserve">Meervoud: das Hobby → ...?</w:t>
+            </w:r>
+          </w:p>
+          <w:p>
+            <w:pPr>
+              <w:pBdr>
+                <w:bottom w:val="single" w:color="AAAAAA" w:sz="4" w:space="1"/>
+              </w:pBdr>
+              <w:spacing w:after="80" w:before="40"/>
+            </w:pPr>
+            <w:r>
+              <w:t xml:space="preserve"/>
+            </w:r>
+          </w:p>
+        </w:tc>
+      </w:tr>
+      <w:tr>
+        <w:tc>
+          <w:tcPr>
+            <w:tcW w:type="dxa" w:w="700"/>
+          </w:tcPr>
+          <w:p>
+            <w:r>
+              <w:rPr>
+                <w:b/>
+                <w:bCs/>
+                <w:sz w:val="20"/>
+                <w:szCs w:val="20"/>
+              </w:rPr>
+              <w:t xml:space="preserve">123.</w:t>
+            </w:r>
+          </w:p>
+        </w:tc>
+        <w:tc>
+          <w:tcPr>
+            <w:tcW w:type="dxa" w:w="8140"/>
+          </w:tcPr>
+          <w:p>
+            <w:r>
+              <w:rPr>
+                <w:sz w:val="20"/>
+                <w:szCs w:val="20"/>
+              </w:rPr>
+              <w:t xml:space="preserve">Meervoud: das Klavier → ...?</w:t>
             </w:r>
           </w:p>
           <w:p>
@@ -10018,6 +10273,234 @@
                 <w:szCs w:val="19"/>
               </w:rPr>
               <w:t xml:space="preserve">WAAR</w:t>
+            </w:r>
+          </w:p>
+        </w:tc>
+        <w:tc>
+          <w:tcPr>
+            <w:tcW w:type="dxa" w:w="700"/>
+          </w:tcPr>
+          <w:p>
+            <w:r>
+              <w:t xml:space="preserve"/>
+            </w:r>
+          </w:p>
+        </w:tc>
+        <w:tc>
+          <w:tcPr>
+            <w:tcW w:type="dxa" w:w="3820"/>
+          </w:tcPr>
+          <w:p>
+            <w:r>
+              <w:t xml:space="preserve"/>
+            </w:r>
+          </w:p>
+        </w:tc>
+      </w:tr>
+    </w:tbl>
+    <w:p>
+      <w:pPr>
+        <w:spacing w:after="80"/>
+      </w:pPr>
+    </w:p>
+    <w:p>
+      <w:pPr>
+        <w:pBdr>
+          <w:bottom w:val="single" w:color="1F4E79" w:sz="6" w:space="2"/>
+        </w:pBdr>
+        <w:spacing w:after="60" w:before="200"/>
+      </w:pPr>
+      <w:r>
+        <w:rPr>
+          <w:b/>
+          <w:bCs/>
+          <w:color w:val="1F4E79"/>
+          <w:sz w:val="22"/>
+          <w:szCs w:val="22"/>
+        </w:rPr>
+        <w:t xml:space="preserve">Meervoud</w:t>
+      </w:r>
+    </w:p>
+    <w:tbl>
+      <w:tblPr>
+        <w:tblW w:type="dxa" w:w="9040"/>
+        <w:tblBorders>
+          <w:top w:val="none"/>
+          <w:left w:val="none"/>
+          <w:bottom w:val="none"/>
+          <w:right w:val="none"/>
+          <w:insideH w:val="single" w:color="auto" w:sz="4"/>
+          <w:insideV w:val="single" w:color="auto" w:sz="4"/>
+        </w:tblBorders>
+      </w:tblPr>
+      <w:tblGrid>
+        <w:gridCol w:w="700"/>
+        <w:gridCol w:w="3820"/>
+        <w:gridCol w:w="700"/>
+        <w:gridCol w:w="3820"/>
+      </w:tblGrid>
+      <w:tr>
+        <w:tc>
+          <w:tcPr>
+            <w:tcW w:type="dxa" w:w="700"/>
+          </w:tcPr>
+          <w:p>
+            <w:r>
+              <w:rPr>
+                <w:b/>
+                <w:bCs/>
+                <w:sz w:val="19"/>
+                <w:szCs w:val="19"/>
+              </w:rPr>
+              <w:t xml:space="preserve">119.</w:t>
+            </w:r>
+          </w:p>
+        </w:tc>
+        <w:tc>
+          <w:tcPr>
+            <w:tcW w:type="dxa" w:w="3820"/>
+          </w:tcPr>
+          <w:p>
+            <w:r>
+              <w:rPr>
+                <w:b w:val="false"/>
+                <w:bCs w:val="false"/>
+                <w:sz w:val="19"/>
+                <w:szCs w:val="19"/>
+              </w:rPr>
+              <w:t xml:space="preserve">die Gitarren</w:t>
+            </w:r>
+          </w:p>
+        </w:tc>
+        <w:tc>
+          <w:tcPr>
+            <w:tcW w:type="dxa" w:w="700"/>
+          </w:tcPr>
+          <w:p>
+            <w:r>
+              <w:rPr>
+                <w:b/>
+                <w:bCs/>
+                <w:sz w:val="19"/>
+                <w:szCs w:val="19"/>
+              </w:rPr>
+              <w:t xml:space="preserve">120.</w:t>
+            </w:r>
+          </w:p>
+        </w:tc>
+        <w:tc>
+          <w:tcPr>
+            <w:tcW w:type="dxa" w:w="3820"/>
+          </w:tcPr>
+          <w:p>
+            <w:r>
+              <w:rPr>
+                <w:b w:val="false"/>
+                <w:bCs w:val="false"/>
+                <w:sz w:val="19"/>
+                <w:szCs w:val="19"/>
+              </w:rPr>
+              <w:t xml:space="preserve">die Städte</w:t>
+            </w:r>
+          </w:p>
+        </w:tc>
+      </w:tr>
+      <w:tr>
+        <w:tc>
+          <w:tcPr>
+            <w:tcW w:type="dxa" w:w="700"/>
+          </w:tcPr>
+          <w:p>
+            <w:r>
+              <w:rPr>
+                <w:b/>
+                <w:bCs/>
+                <w:sz w:val="19"/>
+                <w:szCs w:val="19"/>
+              </w:rPr>
+              <w:t xml:space="preserve">121.</w:t>
+            </w:r>
+          </w:p>
+        </w:tc>
+        <w:tc>
+          <w:tcPr>
+            <w:tcW w:type="dxa" w:w="3820"/>
+          </w:tcPr>
+          <w:p>
+            <w:r>
+              <w:rPr>
+                <w:b w:val="false"/>
+                <w:bCs w:val="false"/>
+                <w:sz w:val="19"/>
+                <w:szCs w:val="19"/>
+              </w:rPr>
+              <w:t xml:space="preserve">die Geigen</w:t>
+            </w:r>
+          </w:p>
+        </w:tc>
+        <w:tc>
+          <w:tcPr>
+            <w:tcW w:type="dxa" w:w="700"/>
+          </w:tcPr>
+          <w:p>
+            <w:r>
+              <w:rPr>
+                <w:b/>
+                <w:bCs/>
+                <w:sz w:val="19"/>
+                <w:szCs w:val="19"/>
+              </w:rPr>
+              <w:t xml:space="preserve">122.</w:t>
+            </w:r>
+          </w:p>
+        </w:tc>
+        <w:tc>
+          <w:tcPr>
+            <w:tcW w:type="dxa" w:w="3820"/>
+          </w:tcPr>
+          <w:p>
+            <w:r>
+              <w:rPr>
+                <w:b w:val="false"/>
+                <w:bCs w:val="false"/>
+                <w:sz w:val="19"/>
+                <w:szCs w:val="19"/>
+              </w:rPr>
+              <w:t xml:space="preserve">die Hobbys</w:t>
+            </w:r>
+          </w:p>
+        </w:tc>
+      </w:tr>
+      <w:tr>
+        <w:tc>
+          <w:tcPr>
+            <w:tcW w:type="dxa" w:w="700"/>
+          </w:tcPr>
+          <w:p>
+            <w:r>
+              <w:rPr>
+                <w:b/>
+                <w:bCs/>
+                <w:sz w:val="19"/>
+                <w:szCs w:val="19"/>
+              </w:rPr>
+              <w:t xml:space="preserve">123.</w:t>
+            </w:r>
+          </w:p>
+        </w:tc>
+        <w:tc>
+          <w:tcPr>
+            <w:tcW w:type="dxa" w:w="3820"/>
+          </w:tcPr>
+          <w:p>
+            <w:r>
+              <w:rPr>
+                <w:b w:val="false"/>
+                <w:bCs w:val="false"/>
+                <w:sz w:val="19"/>
+                <w:szCs w:val="19"/>
+              </w:rPr>
+              <w:t xml:space="preserve">die Klaviere</w:t>
             </w:r>
           </w:p>
         </w:tc>

</xml_diff>